<commit_message>
Modelos: clasificar por area del derecho y subir multiples archivos o carpeta completa
</commit_message>
<xml_diff>
--- a/Manual-Sistema-LexFive.docx
+++ b/Manual-Sistema-LexFive.docx
@@ -1475,30 +1475,173 @@
           <w:sz w:val="21"/>
           <w:szCs w:val="21"/>
         </w:rPr>
-        <w:t xml:space="preserve">Una biblioteca reutilizable de plantillas (Word, PDF, etc.) para el equipo.</w:t>
-      </w:r>
-    </w:p>
-    <w:p>
-      <w:pPr>
-        <w:spacing w:before="0" w:after="40"/>
-        <w:ind w:left="360"/>
-      </w:pPr>
-      <w:r>
-        <w:rPr>
-          <w:b/>
-          <w:color w:val="A8853C"/>
-          <w:sz w:val="21"/>
-          <w:szCs w:val="21"/>
-        </w:rPr>
-        <w:t xml:space="preserve">•  </w:t>
-      </w:r>
-      <w:r>
-        <w:rPr>
-          <w:color w:val="1A2330"/>
-          <w:sz w:val="21"/>
-          <w:szCs w:val="21"/>
-        </w:rPr>
-        <w:t xml:space="preserve">Suba un modelo con su nombre y categoría, y el archivo correspondiente.</w:t>
+        <w:t xml:space="preserve">Una biblioteca reutilizable de plantillas (Word, PDF, imágenes, etc.) para el equipo, organizada por área del derecho.</w:t>
+      </w:r>
+    </w:p>
+    <w:p>
+      <w:pPr>
+        <w:spacing w:before="120" w:after="60"/>
+      </w:pPr>
+      <w:r>
+        <w:rPr>
+          <w:b/>
+          <w:color w:val="16273D"/>
+          <w:sz w:val="24"/>
+          <w:szCs w:val="24"/>
+        </w:rPr>
+        <w:t xml:space="preserve">Subir modelos</w:t>
+      </w:r>
+    </w:p>
+    <w:p>
+      <w:pPr>
+        <w:spacing w:before="0" w:after="40"/>
+        <w:ind w:left="360"/>
+      </w:pPr>
+      <w:r>
+        <w:rPr>
+          <w:b/>
+          <w:color w:val="0E1B2C"/>
+          <w:sz w:val="21"/>
+          <w:szCs w:val="21"/>
+        </w:rPr>
+        <w:t xml:space="preserve">1.  </w:t>
+      </w:r>
+      <w:r>
+        <w:rPr>
+          <w:color w:val="1A2330"/>
+          <w:sz w:val="21"/>
+          <w:szCs w:val="21"/>
+        </w:rPr>
+        <w:t xml:space="preserve">Elija el «Área del derecho» (Laboral, Civil, Penal, Familia, etc.).</w:t>
+      </w:r>
+    </w:p>
+    <w:p>
+      <w:pPr>
+        <w:spacing w:before="0" w:after="40"/>
+        <w:ind w:left="360"/>
+      </w:pPr>
+      <w:r>
+        <w:rPr>
+          <w:b/>
+          <w:color w:val="0E1B2C"/>
+          <w:sz w:val="21"/>
+          <w:szCs w:val="21"/>
+        </w:rPr>
+        <w:t xml:space="preserve">2.  </w:t>
+      </w:r>
+      <w:r>
+        <w:rPr>
+          <w:color w:val="1A2330"/>
+          <w:sz w:val="21"/>
+          <w:szCs w:val="21"/>
+        </w:rPr>
+        <w:t xml:space="preserve">Suba varios archivos a la vez, o una carpeta completa: todos quedarán clasificados en el área elegida.</w:t>
+      </w:r>
+    </w:p>
+    <w:p>
+      <w:pPr>
+        <w:spacing w:before="0" w:after="40"/>
+        <w:ind w:left="360"/>
+      </w:pPr>
+      <w:r>
+        <w:rPr>
+          <w:b/>
+          <w:color w:val="0E1B2C"/>
+          <w:sz w:val="21"/>
+          <w:szCs w:val="21"/>
+        </w:rPr>
+        <w:t xml:space="preserve">3.  </w:t>
+      </w:r>
+      <w:r>
+        <w:rPr>
+          <w:color w:val="1A2330"/>
+          <w:sz w:val="21"/>
+          <w:szCs w:val="21"/>
+        </w:rPr>
+        <w:t xml:space="preserve">Si sube un solo archivo puede ponerle un nombre; si sube varios o una carpeta, se usa el nombre de cada archivo.</w:t>
+      </w:r>
+    </w:p>
+    <w:p>
+      <w:pPr>
+        <w:spacing w:before="0" w:after="40"/>
+        <w:ind w:left="360"/>
+      </w:pPr>
+      <w:r>
+        <w:rPr>
+          <w:b/>
+          <w:color w:val="0E1B2C"/>
+          <w:sz w:val="21"/>
+          <w:szCs w:val="21"/>
+        </w:rPr>
+        <w:t xml:space="preserve">4.  </w:t>
+      </w:r>
+      <w:r>
+        <w:rPr>
+          <w:color w:val="1A2330"/>
+          <w:sz w:val="21"/>
+          <w:szCs w:val="21"/>
+        </w:rPr>
+        <w:t xml:space="preserve">Pulse «Subir al área seleccionada»; una barra indica el avance.</w:t>
+      </w:r>
+    </w:p>
+    <w:p>
+      <w:pPr>
+        <w:spacing w:before="120" w:after="60"/>
+      </w:pPr>
+      <w:r>
+        <w:rPr>
+          <w:b/>
+          <w:color w:val="16273D"/>
+          <w:sz w:val="24"/>
+          <w:szCs w:val="24"/>
+        </w:rPr>
+        <w:t xml:space="preserve">Biblioteca</w:t>
+      </w:r>
+    </w:p>
+    <w:p>
+      <w:pPr>
+        <w:spacing w:before="0" w:after="40"/>
+        <w:ind w:left="360"/>
+      </w:pPr>
+      <w:r>
+        <w:rPr>
+          <w:b/>
+          <w:color w:val="A8853C"/>
+          <w:sz w:val="21"/>
+          <w:szCs w:val="21"/>
+        </w:rPr>
+        <w:t xml:space="preserve">•  </w:t>
+      </w:r>
+      <w:r>
+        <w:rPr>
+          <w:color w:val="1A2330"/>
+          <w:sz w:val="21"/>
+          <w:szCs w:val="21"/>
+        </w:rPr>
+        <w:t xml:space="preserve">Los modelos se muestran agrupados por área, con un contador por cada una.</w:t>
+      </w:r>
+    </w:p>
+    <w:p>
+      <w:pPr>
+        <w:spacing w:before="0" w:after="40"/>
+        <w:ind w:left="360"/>
+      </w:pPr>
+      <w:r>
+        <w:rPr>
+          <w:b/>
+          <w:color w:val="A8853C"/>
+          <w:sz w:val="21"/>
+          <w:szCs w:val="21"/>
+        </w:rPr>
+        <w:t xml:space="preserve">•  </w:t>
+      </w:r>
+      <w:r>
+        <w:rPr>
+          <w:color w:val="1A2330"/>
+          <w:sz w:val="21"/>
+          <w:szCs w:val="21"/>
+        </w:rPr>
+        <w:t xml:space="preserve">Filtre por área o use el buscador por nombre.</w:t>
       </w:r>
     </w:p>
     <w:p>
@@ -1522,29 +1665,6 @@
           <w:szCs w:val="21"/>
         </w:rPr>
         <w:t xml:space="preserve">Descargue cualquier modelo cuando lo necesite, o elimínelo si ya no sirve.</w:t>
-      </w:r>
-    </w:p>
-    <w:p>
-      <w:pPr>
-        <w:spacing w:before="0" w:after="40"/>
-        <w:ind w:left="360"/>
-      </w:pPr>
-      <w:r>
-        <w:rPr>
-          <w:b/>
-          <w:color w:val="A8853C"/>
-          <w:sz w:val="21"/>
-          <w:szCs w:val="21"/>
-        </w:rPr>
-        <w:t xml:space="preserve">•  </w:t>
-      </w:r>
-      <w:r>
-        <w:rPr>
-          <w:color w:val="1A2330"/>
-          <w:sz w:val="21"/>
-          <w:szCs w:val="21"/>
-        </w:rPr>
-        <w:t xml:space="preserve">Use el buscador para filtrar por nombre o categoría.</w:t>
       </w:r>
     </w:p>
     <w:p>

</xml_diff>

<commit_message>
Categorias dinamicas: crear areas del derecho desde el panel y reutilizarlas en Procesos y Modelos
</commit_message>
<xml_diff>
--- a/Manual-Sistema-LexFive.docx
+++ b/Manual-Sistema-LexFive.docx
@@ -973,7 +973,7 @@
           <w:sz w:val="21"/>
           <w:szCs w:val="21"/>
         </w:rPr>
-        <w:t xml:space="preserve">Complete los datos: carátula, número/NUREJ, materia, estado, parte contraria y la próxima audiencia.</w:t>
+        <w:t xml:space="preserve">Complete los datos: carátula, número/NUREJ, materia, estado, parte contraria y la próxima audiencia. En «Materia» puede elegir «Crear nueva categoría...» para agregar un área del derecho que no esté en la lista; quedará disponible en todo el sistema.</w:t>
       </w:r>
     </w:p>
     <w:p>
@@ -1535,6 +1535,29 @@
           <w:sz w:val="21"/>
           <w:szCs w:val="21"/>
         </w:rPr>
+        <w:t xml:space="preserve">Si necesita un área que no está en la lista, elija «Crear nueva categoría...», escriba su nombre y quedará disponible al instante en todo el sistema (procesos y modelos).</w:t>
+      </w:r>
+    </w:p>
+    <w:p>
+      <w:pPr>
+        <w:spacing w:before="0" w:after="40"/>
+        <w:ind w:left="360"/>
+      </w:pPr>
+      <w:r>
+        <w:rPr>
+          <w:b/>
+          <w:color w:val="0E1B2C"/>
+          <w:sz w:val="21"/>
+          <w:szCs w:val="21"/>
+        </w:rPr>
+        <w:t xml:space="preserve">3.  </w:t>
+      </w:r>
+      <w:r>
+        <w:rPr>
+          <w:color w:val="1A2330"/>
+          <w:sz w:val="21"/>
+          <w:szCs w:val="21"/>
+        </w:rPr>
         <w:t xml:space="preserve">Suba varios archivos a la vez, o una carpeta completa: todos quedarán clasificados en el área elegida.</w:t>
       </w:r>
     </w:p>
@@ -1550,7 +1573,7 @@
           <w:sz w:val="21"/>
           <w:szCs w:val="21"/>
         </w:rPr>
-        <w:t xml:space="preserve">3.  </w:t>
+        <w:t xml:space="preserve">4.  </w:t>
       </w:r>
       <w:r>
         <w:rPr>
@@ -1573,7 +1596,7 @@
           <w:sz w:val="21"/>
           <w:szCs w:val="21"/>
         </w:rPr>
-        <w:t xml:space="preserve">4.  </w:t>
+        <w:t xml:space="preserve">5.  </w:t>
       </w:r>
       <w:r>
         <w:rPr>
@@ -2412,6 +2435,52 @@
           <w:szCs w:val="21"/>
         </w:rPr>
         <w:t xml:space="preserve">06_consultas.sql — bandeja de Consultas (formulario de contacto).</w:t>
+      </w:r>
+    </w:p>
+    <w:p>
+      <w:pPr>
+        <w:spacing w:before="0" w:after="40"/>
+        <w:ind w:left="360"/>
+      </w:pPr>
+      <w:r>
+        <w:rPr>
+          <w:b/>
+          <w:color w:val="A8853C"/>
+          <w:sz w:val="21"/>
+          <w:szCs w:val="21"/>
+        </w:rPr>
+        <w:t xml:space="preserve">•  </w:t>
+      </w:r>
+      <w:r>
+        <w:rPr>
+          <w:color w:val="1A2330"/>
+          <w:sz w:val="21"/>
+          <w:szCs w:val="21"/>
+        </w:rPr>
+        <w:t xml:space="preserve">07_sync_clientes.sql — crea la ficha de cliente al registrarse en el portal.</w:t>
+      </w:r>
+    </w:p>
+    <w:p>
+      <w:pPr>
+        <w:spacing w:before="0" w:after="40"/>
+        <w:ind w:left="360"/>
+      </w:pPr>
+      <w:r>
+        <w:rPr>
+          <w:b/>
+          <w:color w:val="A8853C"/>
+          <w:sz w:val="21"/>
+          <w:szCs w:val="21"/>
+        </w:rPr>
+        <w:t xml:space="preserve">•  </w:t>
+      </w:r>
+      <w:r>
+        <w:rPr>
+          <w:color w:val="1A2330"/>
+          <w:sz w:val="21"/>
+          <w:szCs w:val="21"/>
+        </w:rPr>
+        <w:t xml:space="preserve">08_categorias.sql — áreas del derecho dinámicas (crear categorías desde el panel).</w:t>
       </w:r>
     </w:p>
     <w:p>

</xml_diff>

<commit_message>
Categorias: pestana Administrar categorias (crear, renombrar, eliminar) solo admin + manual actualizado
</commit_message>
<xml_diff>
--- a/Manual-Sistema-LexFive.docx
+++ b/Manual-Sistema-LexFive.docx
@@ -209,7 +209,7 @@
           <w:sz w:val="21"/>
           <w:szCs w:val="21"/>
         </w:rPr>
-        <w:t xml:space="preserve">•  12. Auditoría (administrador)</w:t>
+        <w:t xml:space="preserve">•  12. Categorías / áreas del derecho (administrador)</w:t>
       </w:r>
     </w:p>
     <w:p>
@@ -223,7 +223,7 @@
           <w:sz w:val="21"/>
           <w:szCs w:val="21"/>
         </w:rPr>
-        <w:t xml:space="preserve">•  13. Portal del cliente</w:t>
+        <w:t xml:space="preserve">•  13. Auditoría (administrador)</w:t>
       </w:r>
     </w:p>
     <w:p>
@@ -237,7 +237,7 @@
           <w:sz w:val="21"/>
           <w:szCs w:val="21"/>
         </w:rPr>
-        <w:t xml:space="preserve">•  14. La página web pública</w:t>
+        <w:t xml:space="preserve">•  14. Portal del cliente</w:t>
       </w:r>
     </w:p>
     <w:p>
@@ -251,7 +251,7 @@
           <w:sz w:val="21"/>
           <w:szCs w:val="21"/>
         </w:rPr>
-        <w:t xml:space="preserve">•  15. Configuración técnica (Supabase y despliegue)</w:t>
+        <w:t xml:space="preserve">•  15. La página web pública</w:t>
       </w:r>
     </w:p>
     <w:p>
@@ -265,7 +265,7 @@
           <w:sz w:val="21"/>
           <w:szCs w:val="21"/>
         </w:rPr>
-        <w:t xml:space="preserve">•  16. Cómo agregar un nuevo abogado</w:t>
+        <w:t xml:space="preserve">•  16. Configuración técnica (Supabase y despliegue)</w:t>
       </w:r>
     </w:p>
     <w:p>
@@ -279,7 +279,7 @@
           <w:sz w:val="21"/>
           <w:szCs w:val="21"/>
         </w:rPr>
-        <w:t xml:space="preserve">•  17. Mantenimiento y buenas prácticas</w:t>
+        <w:t xml:space="preserve">•  17. Cómo agregar un nuevo abogado</w:t>
       </w:r>
     </w:p>
     <w:p>
@@ -293,7 +293,7 @@
           <w:sz w:val="21"/>
           <w:szCs w:val="21"/>
         </w:rPr>
-        <w:t xml:space="preserve">•  18. Solución de problemas frecuentes</w:t>
+        <w:t xml:space="preserve">•  18. Mantenimiento y buenas prácticas</w:t>
       </w:r>
     </w:p>
     <w:p>
@@ -307,7 +307,21 @@
           <w:sz w:val="21"/>
           <w:szCs w:val="21"/>
         </w:rPr>
-        <w:t xml:space="preserve">•  19. Soporte</w:t>
+        <w:t xml:space="preserve">•  19. Solución de problemas frecuentes</w:t>
+      </w:r>
+    </w:p>
+    <w:p>
+      <w:pPr>
+        <w:spacing w:before="0" w:after="20"/>
+        <w:ind w:left="120"/>
+      </w:pPr>
+      <w:r>
+        <w:rPr>
+          <w:color w:val="1A2330"/>
+          <w:sz w:val="21"/>
+          <w:szCs w:val="21"/>
+        </w:rPr>
+        <w:t xml:space="preserve">•  20. Soporte</w:t>
       </w:r>
     </w:p>
     <w:p>
@@ -2013,7 +2027,7 @@
           <w:sz w:val="30"/>
           <w:szCs w:val="30"/>
         </w:rPr>
-        <w:t xml:space="preserve">12. Auditoría (administrador)</w:t>
+        <w:t xml:space="preserve">12. Categorías / áreas del derecho (administrador)</w:t>
       </w:r>
     </w:p>
     <w:p>
@@ -2026,199 +2040,76 @@
           <w:sz w:val="21"/>
           <w:szCs w:val="21"/>
         </w:rPr>
-        <w:t xml:space="preserve">Es la bitácora del sistema. Registra las acciones importantes (quién creó, editó o eliminó algo, cambios de rol, moderación de testimonios, etc.), con fecha, usuario y detalle. Útil para control interno y transparencia.</w:t>
-      </w:r>
-    </w:p>
-    <w:p>
-      <w:pPr>
-        <w:spacing w:before="200" w:after="80"/>
-      </w:pPr>
-      <w:r>
-        <w:rPr>
-          <w:b/>
-          <w:color w:val="0E1B2C"/>
-          <w:sz w:val="30"/>
-          <w:szCs w:val="30"/>
-        </w:rPr>
-        <w:t xml:space="preserve">13. Portal del cliente</w:t>
-      </w:r>
-    </w:p>
-    <w:p>
-      <w:pPr>
-        <w:spacing w:before="0" w:after="80"/>
-      </w:pPr>
-      <w:r>
-        <w:rPr>
-          <w:color w:val="1A2330"/>
-          <w:sz w:val="21"/>
-          <w:szCs w:val="21"/>
-        </w:rPr>
-        <w:t xml:space="preserve">Cuando un cliente inicia sesión, ve una versión reducida y privada:</w:t>
-      </w:r>
-    </w:p>
-    <w:p>
-      <w:pPr>
-        <w:spacing w:before="0" w:after="40"/>
-        <w:ind w:left="360"/>
-      </w:pPr>
-      <w:r>
-        <w:rPr>
-          <w:b/>
-          <w:color w:val="A8853C"/>
-          <w:sz w:val="21"/>
-          <w:szCs w:val="21"/>
-        </w:rPr>
-        <w:t xml:space="preserve">•  </w:t>
-      </w:r>
-      <w:r>
-        <w:rPr>
-          <w:color w:val="1A2330"/>
-          <w:sz w:val="21"/>
-          <w:szCs w:val="21"/>
-        </w:rPr>
-        <w:t xml:space="preserve">Mis procesos: el listado de sus casos, su estado y la próxima audiencia, además de un botón para consultar por WhatsApp.</w:t>
-      </w:r>
-    </w:p>
-    <w:p>
-      <w:pPr>
-        <w:spacing w:before="0" w:after="40"/>
-        <w:ind w:left="360"/>
-      </w:pPr>
-      <w:r>
-        <w:rPr>
-          <w:b/>
-          <w:color w:val="A8853C"/>
-          <w:sz w:val="21"/>
-          <w:szCs w:val="21"/>
-        </w:rPr>
-        <w:t xml:space="preserve">•  </w:t>
-      </w:r>
-      <w:r>
-        <w:rPr>
-          <w:color w:val="1A2330"/>
-          <w:sz w:val="21"/>
-          <w:szCs w:val="21"/>
-        </w:rPr>
-        <w:t xml:space="preserve">Mi opinión: un formulario para calificar el servicio y dejar un comentario, que el bufete revisa antes de publicarlo.</w:t>
-      </w:r>
-    </w:p>
-    <w:p>
-      <w:pPr>
-        <w:spacing w:before="200" w:after="80"/>
-      </w:pPr>
-      <w:r>
-        <w:rPr>
-          <w:b/>
-          <w:color w:val="0E1B2C"/>
-          <w:sz w:val="30"/>
-          <w:szCs w:val="30"/>
-        </w:rPr>
-        <w:t xml:space="preserve">14. La página web pública</w:t>
-      </w:r>
-    </w:p>
-    <w:p>
-      <w:pPr>
-        <w:spacing w:before="0" w:after="80"/>
-      </w:pPr>
-      <w:r>
-        <w:rPr>
-          <w:color w:val="1A2330"/>
-          <w:sz w:val="21"/>
-          <w:szCs w:val="21"/>
-        </w:rPr>
-        <w:t xml:space="preserve">Es la cara del bufete hacia los clientes. Incluye:</w:t>
-      </w:r>
-    </w:p>
-    <w:p>
-      <w:pPr>
-        <w:spacing w:before="0" w:after="40"/>
-        <w:ind w:left="360"/>
-      </w:pPr>
-      <w:r>
-        <w:rPr>
-          <w:b/>
-          <w:color w:val="A8853C"/>
-          <w:sz w:val="21"/>
-          <w:szCs w:val="21"/>
-        </w:rPr>
-        <w:t xml:space="preserve">•  </w:t>
-      </w:r>
-      <w:r>
-        <w:rPr>
-          <w:color w:val="1A2330"/>
-          <w:sz w:val="21"/>
-          <w:szCs w:val="21"/>
-        </w:rPr>
-        <w:t xml:space="preserve">Inicio, Áreas de práctica, Nosotros (equipo), Casos de éxito, Blog y Preguntas frecuentes.</w:t>
-      </w:r>
-    </w:p>
-    <w:p>
-      <w:pPr>
-        <w:spacing w:before="0" w:after="40"/>
-        <w:ind w:left="360"/>
-      </w:pPr>
-      <w:r>
-        <w:rPr>
-          <w:b/>
-          <w:color w:val="A8853C"/>
-          <w:sz w:val="21"/>
-          <w:szCs w:val="21"/>
-        </w:rPr>
-        <w:t xml:space="preserve">•  </w:t>
-      </w:r>
-      <w:r>
-        <w:rPr>
-          <w:color w:val="1A2330"/>
-          <w:sz w:val="21"/>
-          <w:szCs w:val="21"/>
-        </w:rPr>
-        <w:t xml:space="preserve">Sección «Contáctenos» con el formulario (que llega a la bandeja de Consultas) y la opción de escribir por WhatsApp a un abogado específico.</w:t>
-      </w:r>
-    </w:p>
-    <w:p>
-      <w:pPr>
-        <w:spacing w:before="0" w:after="40"/>
-        <w:ind w:left="360"/>
-      </w:pPr>
-      <w:r>
-        <w:rPr>
-          <w:b/>
-          <w:color w:val="A8853C"/>
-          <w:sz w:val="21"/>
-          <w:szCs w:val="21"/>
-        </w:rPr>
-        <w:t xml:space="preserve">•  </w:t>
-      </w:r>
-      <w:r>
-        <w:rPr>
-          <w:color w:val="1A2330"/>
-          <w:sz w:val="21"/>
-          <w:szCs w:val="21"/>
-        </w:rPr>
-        <w:t xml:space="preserve">Botón flotante de WhatsApp que abre un menú con los cinco abogados.</w:t>
-      </w:r>
-    </w:p>
-    <w:p>
-      <w:pPr>
-        <w:spacing w:before="0" w:after="40"/>
-        <w:ind w:left="360"/>
-      </w:pPr>
-      <w:r>
-        <w:rPr>
-          <w:b/>
-          <w:color w:val="A8853C"/>
-          <w:sz w:val="21"/>
-          <w:szCs w:val="21"/>
-        </w:rPr>
-        <w:t xml:space="preserve">•  </w:t>
-      </w:r>
-      <w:r>
-        <w:rPr>
-          <w:color w:val="1A2330"/>
-          <w:sz w:val="21"/>
-          <w:szCs w:val="21"/>
-        </w:rPr>
-        <w:t xml:space="preserve">Páginas legales: Aviso de privacidad y Términos y condiciones, enlazadas en el pie de página.</w:t>
+        <w:t xml:space="preserve">Las áreas del derecho (Laboral, Civil, Penal, etc.) clasifican los procesos y los modelos de memoriales. Esta pestaña permite administrarlas:</w:t>
+      </w:r>
+    </w:p>
+    <w:p>
+      <w:pPr>
+        <w:spacing w:before="0" w:after="40"/>
+        <w:ind w:left="360"/>
+      </w:pPr>
+      <w:r>
+        <w:rPr>
+          <w:b/>
+          <w:color w:val="A8853C"/>
+          <w:sz w:val="21"/>
+          <w:szCs w:val="21"/>
+        </w:rPr>
+        <w:t xml:space="preserve">•  </w:t>
+      </w:r>
+      <w:r>
+        <w:rPr>
+          <w:color w:val="1A2330"/>
+          <w:sz w:val="21"/>
+          <w:szCs w:val="21"/>
+        </w:rPr>
+        <w:t xml:space="preserve">Crear una categoría nueva: aparece al instante en las listas de Procesos y Modelos.</w:t>
+      </w:r>
+    </w:p>
+    <w:p>
+      <w:pPr>
+        <w:spacing w:before="0" w:after="40"/>
+        <w:ind w:left="360"/>
+      </w:pPr>
+      <w:r>
+        <w:rPr>
+          <w:b/>
+          <w:color w:val="A8853C"/>
+          <w:sz w:val="21"/>
+          <w:szCs w:val="21"/>
+        </w:rPr>
+        <w:t xml:space="preserve">•  </w:t>
+      </w:r>
+      <w:r>
+        <w:rPr>
+          <w:color w:val="1A2330"/>
+          <w:sz w:val="21"/>
+          <w:szCs w:val="21"/>
+        </w:rPr>
+        <w:t xml:space="preserve">Renombrar una categoría: los procesos y modelos que la usaban se actualizan automáticamente, sin perder su clasificación.</w:t>
+      </w:r>
+    </w:p>
+    <w:p>
+      <w:pPr>
+        <w:spacing w:before="0" w:after="40"/>
+        <w:ind w:left="360"/>
+      </w:pPr>
+      <w:r>
+        <w:rPr>
+          <w:b/>
+          <w:color w:val="A8853C"/>
+          <w:sz w:val="21"/>
+          <w:szCs w:val="21"/>
+        </w:rPr>
+        <w:t xml:space="preserve">•  </w:t>
+      </w:r>
+      <w:r>
+        <w:rPr>
+          <w:color w:val="1A2330"/>
+          <w:sz w:val="21"/>
+          <w:szCs w:val="21"/>
+        </w:rPr>
+        <w:t xml:space="preserve">Eliminar una categoría: solo es posible si no está en uso (la tabla muestra cuántos procesos y modelos usan cada una).</w:t>
       </w:r>
     </w:p>
     <w:p>
@@ -2234,7 +2125,7 @@
           <w:sz w:val="20"/>
           <w:szCs w:val="20"/>
         </w:rPr>
-        <w:t xml:space="preserve">Privacidad del equipo:  </w:t>
+        <w:t xml:space="preserve">Atajo:  </w:t>
       </w:r>
       <w:r>
         <w:rPr>
@@ -2242,7 +2133,7 @@
           <w:sz w:val="20"/>
           <w:szCs w:val="20"/>
         </w:rPr>
-        <w:t xml:space="preserve">La barra superior y el pie ya no muestran correos ni teléfonos personales: el canal principal es el formulario y, de forma directa, el WhatsApp de cada abogado.</w:t>
+        <w:t xml:space="preserve">También puede crear una categoría sobre la marcha desde los formularios de Procesos y de Modelos, eligiendo «Crear nueva categoría...» en el selector de área.</w:t>
       </w:r>
     </w:p>
     <w:p>
@@ -2256,7 +2147,250 @@
           <w:sz w:val="30"/>
           <w:szCs w:val="30"/>
         </w:rPr>
-        <w:t xml:space="preserve">15. Configuración técnica (Supabase y despliegue)</w:t>
+        <w:t xml:space="preserve">13. Auditoría (administrador)</w:t>
+      </w:r>
+    </w:p>
+    <w:p>
+      <w:pPr>
+        <w:spacing w:before="0" w:after="80"/>
+      </w:pPr>
+      <w:r>
+        <w:rPr>
+          <w:color w:val="1A2330"/>
+          <w:sz w:val="21"/>
+          <w:szCs w:val="21"/>
+        </w:rPr>
+        <w:t xml:space="preserve">Es la bitácora del sistema. Registra las acciones importantes (quién creó, editó o eliminó algo, cambios de rol, moderación de testimonios, etc.), con fecha, usuario y detalle. Útil para control interno y transparencia.</w:t>
+      </w:r>
+    </w:p>
+    <w:p>
+      <w:pPr>
+        <w:spacing w:before="200" w:after="80"/>
+      </w:pPr>
+      <w:r>
+        <w:rPr>
+          <w:b/>
+          <w:color w:val="0E1B2C"/>
+          <w:sz w:val="30"/>
+          <w:szCs w:val="30"/>
+        </w:rPr>
+        <w:t xml:space="preserve">14. Portal del cliente</w:t>
+      </w:r>
+    </w:p>
+    <w:p>
+      <w:pPr>
+        <w:spacing w:before="0" w:after="80"/>
+      </w:pPr>
+      <w:r>
+        <w:rPr>
+          <w:color w:val="1A2330"/>
+          <w:sz w:val="21"/>
+          <w:szCs w:val="21"/>
+        </w:rPr>
+        <w:t xml:space="preserve">Cuando un cliente inicia sesión, ve una versión reducida y privada:</w:t>
+      </w:r>
+    </w:p>
+    <w:p>
+      <w:pPr>
+        <w:spacing w:before="0" w:after="40"/>
+        <w:ind w:left="360"/>
+      </w:pPr>
+      <w:r>
+        <w:rPr>
+          <w:b/>
+          <w:color w:val="A8853C"/>
+          <w:sz w:val="21"/>
+          <w:szCs w:val="21"/>
+        </w:rPr>
+        <w:t xml:space="preserve">•  </w:t>
+      </w:r>
+      <w:r>
+        <w:rPr>
+          <w:color w:val="1A2330"/>
+          <w:sz w:val="21"/>
+          <w:szCs w:val="21"/>
+        </w:rPr>
+        <w:t xml:space="preserve">Mis procesos: el listado de sus casos, su estado y la próxima audiencia, además de un botón para consultar por WhatsApp.</w:t>
+      </w:r>
+    </w:p>
+    <w:p>
+      <w:pPr>
+        <w:spacing w:before="0" w:after="40"/>
+        <w:ind w:left="360"/>
+      </w:pPr>
+      <w:r>
+        <w:rPr>
+          <w:b/>
+          <w:color w:val="A8853C"/>
+          <w:sz w:val="21"/>
+          <w:szCs w:val="21"/>
+        </w:rPr>
+        <w:t xml:space="preserve">•  </w:t>
+      </w:r>
+      <w:r>
+        <w:rPr>
+          <w:color w:val="1A2330"/>
+          <w:sz w:val="21"/>
+          <w:szCs w:val="21"/>
+        </w:rPr>
+        <w:t xml:space="preserve">Mi opinión: un formulario para calificar el servicio y dejar un comentario, que el bufete revisa antes de publicarlo.</w:t>
+      </w:r>
+    </w:p>
+    <w:p>
+      <w:pPr>
+        <w:spacing w:before="200" w:after="80"/>
+      </w:pPr>
+      <w:r>
+        <w:rPr>
+          <w:b/>
+          <w:color w:val="0E1B2C"/>
+          <w:sz w:val="30"/>
+          <w:szCs w:val="30"/>
+        </w:rPr>
+        <w:t xml:space="preserve">15. La página web pública</w:t>
+      </w:r>
+    </w:p>
+    <w:p>
+      <w:pPr>
+        <w:spacing w:before="0" w:after="80"/>
+      </w:pPr>
+      <w:r>
+        <w:rPr>
+          <w:color w:val="1A2330"/>
+          <w:sz w:val="21"/>
+          <w:szCs w:val="21"/>
+        </w:rPr>
+        <w:t xml:space="preserve">Es la cara del bufete hacia los clientes. Incluye:</w:t>
+      </w:r>
+    </w:p>
+    <w:p>
+      <w:pPr>
+        <w:spacing w:before="0" w:after="40"/>
+        <w:ind w:left="360"/>
+      </w:pPr>
+      <w:r>
+        <w:rPr>
+          <w:b/>
+          <w:color w:val="A8853C"/>
+          <w:sz w:val="21"/>
+          <w:szCs w:val="21"/>
+        </w:rPr>
+        <w:t xml:space="preserve">•  </w:t>
+      </w:r>
+      <w:r>
+        <w:rPr>
+          <w:color w:val="1A2330"/>
+          <w:sz w:val="21"/>
+          <w:szCs w:val="21"/>
+        </w:rPr>
+        <w:t xml:space="preserve">Inicio, Áreas de práctica, Nosotros (equipo), Casos de éxito, Blog y Preguntas frecuentes.</w:t>
+      </w:r>
+    </w:p>
+    <w:p>
+      <w:pPr>
+        <w:spacing w:before="0" w:after="40"/>
+        <w:ind w:left="360"/>
+      </w:pPr>
+      <w:r>
+        <w:rPr>
+          <w:b/>
+          <w:color w:val="A8853C"/>
+          <w:sz w:val="21"/>
+          <w:szCs w:val="21"/>
+        </w:rPr>
+        <w:t xml:space="preserve">•  </w:t>
+      </w:r>
+      <w:r>
+        <w:rPr>
+          <w:color w:val="1A2330"/>
+          <w:sz w:val="21"/>
+          <w:szCs w:val="21"/>
+        </w:rPr>
+        <w:t xml:space="preserve">Sección «Contáctenos» con el formulario (que llega a la bandeja de Consultas) y la opción de escribir por WhatsApp a un abogado específico.</w:t>
+      </w:r>
+    </w:p>
+    <w:p>
+      <w:pPr>
+        <w:spacing w:before="0" w:after="40"/>
+        <w:ind w:left="360"/>
+      </w:pPr>
+      <w:r>
+        <w:rPr>
+          <w:b/>
+          <w:color w:val="A8853C"/>
+          <w:sz w:val="21"/>
+          <w:szCs w:val="21"/>
+        </w:rPr>
+        <w:t xml:space="preserve">•  </w:t>
+      </w:r>
+      <w:r>
+        <w:rPr>
+          <w:color w:val="1A2330"/>
+          <w:sz w:val="21"/>
+          <w:szCs w:val="21"/>
+        </w:rPr>
+        <w:t xml:space="preserve">Botón flotante de WhatsApp que abre un menú con los cinco abogados.</w:t>
+      </w:r>
+    </w:p>
+    <w:p>
+      <w:pPr>
+        <w:spacing w:before="0" w:after="40"/>
+        <w:ind w:left="360"/>
+      </w:pPr>
+      <w:r>
+        <w:rPr>
+          <w:b/>
+          <w:color w:val="A8853C"/>
+          <w:sz w:val="21"/>
+          <w:szCs w:val="21"/>
+        </w:rPr>
+        <w:t xml:space="preserve">•  </w:t>
+      </w:r>
+      <w:r>
+        <w:rPr>
+          <w:color w:val="1A2330"/>
+          <w:sz w:val="21"/>
+          <w:szCs w:val="21"/>
+        </w:rPr>
+        <w:t xml:space="preserve">Páginas legales: Aviso de privacidad y Términos y condiciones, enlazadas en el pie de página.</w:t>
+      </w:r>
+    </w:p>
+    <w:p>
+      <w:pPr>
+        <w:spacing w:before="60" w:after="120"/>
+        <w:ind w:left="120"/>
+        <w:shd w:val="clear" w:fill="F6F4ED"/>
+      </w:pPr>
+      <w:r>
+        <w:rPr>
+          <w:b/>
+          <w:color w:val="A8853C"/>
+          <w:sz w:val="20"/>
+          <w:szCs w:val="20"/>
+        </w:rPr>
+        <w:t xml:space="preserve">Privacidad del equipo:  </w:t>
+      </w:r>
+      <w:r>
+        <w:rPr>
+          <w:color w:val="1A2330"/>
+          <w:sz w:val="20"/>
+          <w:szCs w:val="20"/>
+        </w:rPr>
+        <w:t xml:space="preserve">La barra superior y el pie ya no muestran correos ni teléfonos personales: el canal principal es el formulario y, de forma directa, el WhatsApp de cada abogado.</w:t>
+      </w:r>
+    </w:p>
+    <w:p>
+      <w:pPr>
+        <w:spacing w:before="200" w:after="80"/>
+      </w:pPr>
+      <w:r>
+        <w:rPr>
+          <w:b/>
+          <w:color w:val="0E1B2C"/>
+          <w:sz w:val="30"/>
+          <w:szCs w:val="30"/>
+        </w:rPr>
+        <w:t xml:space="preserve">16. Configuración técnica (Supabase y despliegue)</w:t>
       </w:r>
     </w:p>
     <w:p>
@@ -2581,7 +2715,7 @@
           <w:sz w:val="30"/>
           <w:szCs w:val="30"/>
         </w:rPr>
-        <w:t xml:space="preserve">16. Cómo agregar un nuevo abogado</w:t>
+        <w:t xml:space="preserve">17. Cómo agregar un nuevo abogado</w:t>
       </w:r>
     </w:p>
     <w:p>
@@ -2687,7 +2821,7 @@
           <w:sz w:val="30"/>
           <w:szCs w:val="30"/>
         </w:rPr>
-        <w:t xml:space="preserve">17. Mantenimiento y buenas prácticas</w:t>
+        <w:t xml:space="preserve">18. Mantenimiento y buenas prácticas</w:t>
       </w:r>
     </w:p>
     <w:p>
@@ -2839,7 +2973,7 @@
           <w:sz w:val="30"/>
           <w:szCs w:val="30"/>
         </w:rPr>
-        <w:t xml:space="preserve">18. Solución de problemas frecuentes</w:t>
+        <w:t xml:space="preserve">19. Solución de problemas frecuentes</w:t>
       </w:r>
     </w:p>
     <w:p>
@@ -3050,7 +3184,7 @@
           <w:sz w:val="30"/>
           <w:szCs w:val="30"/>
         </w:rPr>
-        <w:t xml:space="preserve">19. Soporte</w:t>
+        <w:t xml:space="preserve">20. Soporte</w:t>
       </w:r>
     </w:p>
     <w:p>

</xml_diff>

<commit_message>
Procesos: adjuntar archivos a cada actuacion (respuesta de juzgado y nuevo memorial), visibles para el cliente
</commit_message>
<xml_diff>
--- a/Manual-Sistema-LexFive.docx
+++ b/Manual-Sistema-LexFive.docx
@@ -1093,30 +1093,76 @@
           <w:sz w:val="21"/>
           <w:szCs w:val="21"/>
         </w:rPr>
-        <w:t xml:space="preserve">Dentro del detalle de un proceso puede subir documentos (memoriales, notificaciones, etc.) y descargarlos cuando los necesite.</w:t>
-      </w:r>
-    </w:p>
-    <w:p>
-      <w:pPr>
-        <w:spacing w:before="0" w:after="40"/>
-        <w:ind w:left="360"/>
-      </w:pPr>
-      <w:r>
-        <w:rPr>
-          <w:b/>
-          <w:color w:val="A8853C"/>
-          <w:sz w:val="21"/>
-          <w:szCs w:val="21"/>
-        </w:rPr>
-        <w:t xml:space="preserve">•  </w:t>
-      </w:r>
-      <w:r>
-        <w:rPr>
-          <w:color w:val="1A2330"/>
-          <w:sz w:val="21"/>
-          <w:szCs w:val="21"/>
-        </w:rPr>
-        <w:t xml:space="preserve">Puede registrar actuaciones con fecha y descripción para llevar la bitácora del caso.</w:t>
+        <w:t xml:space="preserve">Documentos generales del proceso: en «Memoriales y documentos» puede subir y descargar archivos sueltos (carátula, poder, anexos, etc.).</w:t>
+      </w:r>
+    </w:p>
+    <w:p>
+      <w:pPr>
+        <w:spacing w:before="0" w:after="40"/>
+        <w:ind w:left="360"/>
+      </w:pPr>
+      <w:r>
+        <w:rPr>
+          <w:b/>
+          <w:color w:val="A8853C"/>
+          <w:sz w:val="21"/>
+          <w:szCs w:val="21"/>
+        </w:rPr>
+        <w:t xml:space="preserve">•  </w:t>
+      </w:r>
+      <w:r>
+        <w:rPr>
+          <w:color w:val="1A2330"/>
+          <w:sz w:val="21"/>
+          <w:szCs w:val="21"/>
+        </w:rPr>
+        <w:t xml:space="preserve">Historial de actuaciones: registre cada paso del proceso con su fecha y una descripción (por ejemplo, «Respuesta del juzgado» o «Nuevo memorial presentado»).</w:t>
+      </w:r>
+    </w:p>
+    <w:p>
+      <w:pPr>
+        <w:spacing w:before="0" w:after="40"/>
+        <w:ind w:left="360"/>
+      </w:pPr>
+      <w:r>
+        <w:rPr>
+          <w:b/>
+          <w:color w:val="A8853C"/>
+          <w:sz w:val="21"/>
+          <w:szCs w:val="21"/>
+        </w:rPr>
+        <w:t xml:space="preserve">•  </w:t>
+      </w:r>
+      <w:r>
+        <w:rPr>
+          <w:color w:val="1A2330"/>
+          <w:sz w:val="21"/>
+          <w:szCs w:val="21"/>
+        </w:rPr>
+        <w:t xml:space="preserve">A cada paso del historial puede adjuntar uno o varios archivos: así sube la respuesta recibida del juzgado y, junto a ella, el nuevo memorial que se presentará.</w:t>
+      </w:r>
+    </w:p>
+    <w:p>
+      <w:pPr>
+        <w:spacing w:before="0" w:after="40"/>
+        <w:ind w:left="360"/>
+      </w:pPr>
+      <w:r>
+        <w:rPr>
+          <w:b/>
+          <w:color w:val="A8853C"/>
+          <w:sz w:val="21"/>
+          <w:szCs w:val="21"/>
+        </w:rPr>
+        <w:t xml:space="preserve">•  </w:t>
+      </w:r>
+      <w:r>
+        <w:rPr>
+          <w:color w:val="1A2330"/>
+          <w:sz w:val="21"/>
+          <w:szCs w:val="21"/>
+        </w:rPr>
+        <w:t xml:space="preserve">El cliente del caso ve su historial en modo lectura: puede abrir y descargar la respuesta del juzgado y el nuevo memorial, pero no modificar nada.</w:t>
       </w:r>
     </w:p>
     <w:p>
@@ -2233,6 +2279,29 @@
           <w:sz w:val="21"/>
           <w:szCs w:val="21"/>
         </w:rPr>
+        <w:t xml:space="preserve">Dentro de cada caso ve su historial de actuaciones y puede descargar los archivos de cada paso: la respuesta del juzgado y el nuevo memorial presentado, entre otros.</w:t>
+      </w:r>
+    </w:p>
+    <w:p>
+      <w:pPr>
+        <w:spacing w:before="0" w:after="40"/>
+        <w:ind w:left="360"/>
+      </w:pPr>
+      <w:r>
+        <w:rPr>
+          <w:b/>
+          <w:color w:val="A8853C"/>
+          <w:sz w:val="21"/>
+          <w:szCs w:val="21"/>
+        </w:rPr>
+        <w:t xml:space="preserve">•  </w:t>
+      </w:r>
+      <w:r>
+        <w:rPr>
+          <w:color w:val="1A2330"/>
+          <w:sz w:val="21"/>
+          <w:szCs w:val="21"/>
+        </w:rPr>
         <w:t xml:space="preserve">Mi opinión: un formulario para calificar el servicio y dejar un comentario, que el bufete revisa antes de publicarlo.</w:t>
       </w:r>
     </w:p>
@@ -2615,6 +2684,29 @@
           <w:szCs w:val="21"/>
         </w:rPr>
         <w:t xml:space="preserve">08_categorias.sql — áreas del derecho dinámicas (crear categorías desde el panel).</w:t>
+      </w:r>
+    </w:p>
+    <w:p>
+      <w:pPr>
+        <w:spacing w:before="0" w:after="40"/>
+        <w:ind w:left="360"/>
+      </w:pPr>
+      <w:r>
+        <w:rPr>
+          <w:b/>
+          <w:color w:val="A8853C"/>
+          <w:sz w:val="21"/>
+          <w:szCs w:val="21"/>
+        </w:rPr>
+        <w:t xml:space="preserve">•  </w:t>
+      </w:r>
+      <w:r>
+        <w:rPr>
+          <w:color w:val="1A2330"/>
+          <w:sz w:val="21"/>
+          <w:szCs w:val="21"/>
+        </w:rPr>
+        <w:t xml:space="preserve">09_actuaciones_archivos.sql — adjuntar archivos a cada actuación del historial.</w:t>
       </w:r>
     </w:p>
     <w:p>

</xml_diff>

<commit_message>
Autoguardado de borradores: recupera procesos y actuaciones tras cierre de sesion por inactividad
</commit_message>
<xml_diff>
--- a/Manual-Sistema-LexFive.docx
+++ b/Manual-Sistema-LexFive.docx
@@ -758,6 +758,29 @@
           <w:sz w:val="21"/>
           <w:szCs w:val="21"/>
         </w:rPr>
+        <w:t xml:space="preserve">No se preocupe si esto ocurre mientras redacta: el sistema guarda automáticamente lo que escribe (descripción del caso, datos del proceso, una actuación, etc.). Al volver a abrir ese mismo formulario, le ofrecerá «Recuperar» lo que había dejado.</w:t>
+      </w:r>
+    </w:p>
+    <w:p>
+      <w:pPr>
+        <w:spacing w:before="0" w:after="40"/>
+        <w:ind w:left="360"/>
+      </w:pPr>
+      <w:r>
+        <w:rPr>
+          <w:b/>
+          <w:color w:val="A8853C"/>
+          <w:sz w:val="21"/>
+          <w:szCs w:val="21"/>
+        </w:rPr>
+        <w:t xml:space="preserve">•  </w:t>
+      </w:r>
+      <w:r>
+        <w:rPr>
+          <w:color w:val="1A2330"/>
+          <w:sz w:val="21"/>
+          <w:szCs w:val="21"/>
+        </w:rPr>
         <w:t xml:space="preserve">Use el botón «Cerrar sesión» al terminar, sobre todo en equipos compartidos.</w:t>
       </w:r>
     </w:p>
@@ -1057,6 +1080,30 @@
           <w:szCs w:val="21"/>
         </w:rPr>
         <w:t xml:space="preserve">Guarde. El proceso queda registrado y visible para el equipo asignado.</w:t>
+      </w:r>
+    </w:p>
+    <w:p>
+      <w:pPr>
+        <w:spacing w:before="60" w:after="120"/>
+        <w:ind w:left="120"/>
+        <w:shd w:val="clear" w:fill="F6F4ED"/>
+      </w:pPr>
+      <w:r>
+        <w:rPr>
+          <w:b/>
+          <w:color w:val="A8853C"/>
+          <w:sz w:val="20"/>
+          <w:szCs w:val="20"/>
+        </w:rPr>
+        <w:t xml:space="preserve">Autoguardado:  </w:t>
+      </w:r>
+      <w:r>
+        <w:rPr>
+          <w:color w:val="1A2330"/>
+          <w:sz w:val="20"/>
+          <w:szCs w:val="20"/>
+        </w:rPr>
+        <w:t xml:space="preserve">Mientras escribe (sobre todo descripciones largas o un memorial), el sistema guarda un borrador automático en su equipo. Si la sesión se cierra o cierra el navegador, al reabrir el formulario podrá «Recuperar» lo que había dejado y solo completar lo que falte. Al guardar, el borrador se descarta.</w:t>
       </w:r>
     </w:p>
     <w:p>

</xml_diff>

<commit_message>
Autoguardado en todos los formularios: clientes, blog, opinion y contacto de la web
</commit_message>
<xml_diff>
--- a/Manual-Sistema-LexFive.docx
+++ b/Manual-Sistema-LexFive.docx
@@ -758,7 +758,7 @@
           <w:sz w:val="21"/>
           <w:szCs w:val="21"/>
         </w:rPr>
-        <w:t xml:space="preserve">No se preocupe si esto ocurre mientras redacta: el sistema guarda automáticamente lo que escribe (descripción del caso, datos del proceso, una actuación, etc.). Al volver a abrir ese mismo formulario, le ofrecerá «Recuperar» lo que había dejado.</w:t>
+        <w:t xml:space="preserve">No se preocupe si esto ocurre mientras redacta: el sistema guarda automáticamente lo que escribe en cualquier formulario (proceso, cliente, actuación, artículo del blog, opinión y el formulario de contacto de la web). Al volver a abrir ese mismo formulario, le ofrecerá «Recuperar» lo que había dejado.</w:t>
       </w:r>
     </w:p>
     <w:p>
@@ -1103,7 +1103,7 @@
           <w:sz w:val="20"/>
           <w:szCs w:val="20"/>
         </w:rPr>
-        <w:t xml:space="preserve">Mientras escribe (sobre todo descripciones largas o un memorial), el sistema guarda un borrador automático en su equipo. Si la sesión se cierra o cierra el navegador, al reabrir el formulario podrá «Recuperar» lo que había dejado y solo completar lo que falte. Al guardar, el borrador se descarta.</w:t>
+        <w:t xml:space="preserve">Mientras escribe (sobre todo descripciones largas o un memorial), el sistema guarda un borrador automático en su equipo. Esto aplica a TODOS los formularios del sistema (procesos, clientes, actuaciones, blog, opinión y el contacto de la web). Si la sesión se cierra o cierra el navegador, al reabrir el formulario podrá «Recuperar» lo que había dejado y solo completar lo que falte. Al guardar, el borrador se descarta.</w:t>
       </w:r>
     </w:p>
     <w:p>

</xml_diff>

<commit_message>
Ayuda en pantalla: tooltips de orientacion en todo el panel para usuarios nuevos
</commit_message>
<xml_diff>
--- a/Manual-Sistema-LexFive.docx
+++ b/Manual-Sistema-LexFive.docx
@@ -432,6 +432,30 @@
           <w:szCs w:val="20"/>
         </w:rPr>
         <w:t xml:space="preserve">Para usar el panel necesita un usuario y contraseña. Para navegar la web pública no se necesita iniciar sesión.</w:t>
+      </w:r>
+    </w:p>
+    <w:p>
+      <w:pPr>
+        <w:spacing w:before="60" w:after="120"/>
+        <w:ind w:left="120"/>
+        <w:shd w:val="clear" w:fill="F6F4ED"/>
+      </w:pPr>
+      <w:r>
+        <w:rPr>
+          <w:b/>
+          <w:color w:val="A8853C"/>
+          <w:sz w:val="20"/>
+          <w:szCs w:val="20"/>
+        </w:rPr>
+        <w:t xml:space="preserve">Ayuda en pantalla:  </w:t>
+      </w:r>
+      <w:r>
+        <w:rPr>
+          <w:color w:val="1A2330"/>
+          <w:sz w:val="20"/>
+          <w:szCs w:val="20"/>
+        </w:rPr>
+        <w:t xml:space="preserve">¿No sabe qué hace un campo o un botón? Pase el mouse (o toque, en celular) sobre el ícono «?» de color dorado que aparece junto a títulos y campos: el propio sistema le explicará para qué sirve y qué debe hacer. Están repartidos por todo el panel.</w:t>
       </w:r>
     </w:p>
     <w:p>

</xml_diff>

<commit_message>
Seguridad: el logo del panel cierra la sesion al ir al sitio publico (autoguardado conserva el trabajo)
</commit_message>
<xml_diff>
--- a/Manual-Sistema-LexFive.docx
+++ b/Manual-Sistema-LexFive.docx
@@ -806,6 +806,29 @@
           <w:szCs w:val="21"/>
         </w:rPr>
         <w:t xml:space="preserve">Use el botón «Cerrar sesión» al terminar, sobre todo en equipos compartidos.</w:t>
+      </w:r>
+    </w:p>
+    <w:p>
+      <w:pPr>
+        <w:spacing w:before="0" w:after="40"/>
+        <w:ind w:left="360"/>
+      </w:pPr>
+      <w:r>
+        <w:rPr>
+          <w:b/>
+          <w:color w:val="A8853C"/>
+          <w:sz w:val="21"/>
+          <w:szCs w:val="21"/>
+        </w:rPr>
+        <w:t xml:space="preserve">•  </w:t>
+      </w:r>
+      <w:r>
+        <w:rPr>
+          <w:color w:val="1A2330"/>
+          <w:sz w:val="21"/>
+          <w:szCs w:val="21"/>
+        </w:rPr>
+        <w:t xml:space="preserve">Al hacer clic en el logo de LexFive (arriba a la izquierda) vuelve al sitio web público y, por seguridad, se cierra su sesión: al regresar deberá ingresar sus credenciales de nuevo. Lo que estaba escribiendo queda autoguardado y se recupera al volver a entrar.</w:t>
       </w:r>
     </w:p>
     <w:p>

</xml_diff>

<commit_message>
Panel: pestana Credenciales y accesos (solo admin y abogados) con guia para habilitar procuradores
</commit_message>
<xml_diff>
--- a/Manual-Sistema-LexFive.docx
+++ b/Manual-Sistema-LexFive.docx
@@ -321,7 +321,21 @@
           <w:sz w:val="21"/>
           <w:szCs w:val="21"/>
         </w:rPr>
-        <w:t xml:space="preserve">•  20. Soporte</w:t>
+        <w:t xml:space="preserve">•  20. Credenciales y accesos (administrador y abogados)</w:t>
+      </w:r>
+    </w:p>
+    <w:p>
+      <w:pPr>
+        <w:spacing w:before="0" w:after="20"/>
+        <w:ind w:left="120"/>
+      </w:pPr>
+      <w:r>
+        <w:rPr>
+          <w:color w:val="1A2330"/>
+          <w:sz w:val="21"/>
+          <w:szCs w:val="21"/>
+        </w:rPr>
+        <w:t xml:space="preserve">•  21. Soporte</w:t>
       </w:r>
     </w:p>
     <w:p>
@@ -3370,7 +3384,127 @@
           <w:sz w:val="30"/>
           <w:szCs w:val="30"/>
         </w:rPr>
-        <w:t xml:space="preserve">20. Soporte</w:t>
+        <w:t xml:space="preserve">20. Credenciales y accesos (administrador y abogados)</w:t>
+      </w:r>
+    </w:p>
+    <w:p>
+      <w:pPr>
+        <w:spacing w:before="0" w:after="80"/>
+      </w:pPr>
+      <w:r>
+        <w:rPr>
+          <w:color w:val="1A2330"/>
+          <w:sz w:val="21"/>
+          <w:szCs w:val="21"/>
+        </w:rPr>
+        <w:t xml:space="preserve">El panel incluye una pestaña «Credenciales», visible solo para el administrador y los abogados (los procuradores y clientes no la ven). Reúne, dentro del propio sistema, cómo se ingresa a cada plataforma (GitHub, Netlify, Supabase, Web3Forms) y el panel, además del recordatorio de la «llave maestra» (el Gmail del bufete).</w:t>
+      </w:r>
+    </w:p>
+    <w:p>
+      <w:pPr>
+        <w:spacing w:before="0" w:after="40"/>
+        <w:ind w:left="360"/>
+      </w:pPr>
+      <w:r>
+        <w:rPr>
+          <w:b/>
+          <w:color w:val="A8853C"/>
+          <w:sz w:val="21"/>
+          <w:szCs w:val="21"/>
+        </w:rPr>
+        <w:t xml:space="preserve">•  </w:t>
+      </w:r>
+      <w:r>
+        <w:rPr>
+          <w:color w:val="1A2330"/>
+          <w:sz w:val="21"/>
+          <w:szCs w:val="21"/>
+        </w:rPr>
+        <w:t xml:space="preserve">Solo el administrador y los abogados pueden consultarla; son ellos quienes entregan las credenciales a sus procuradores.</w:t>
+      </w:r>
+    </w:p>
+    <w:p>
+      <w:pPr>
+        <w:spacing w:before="0" w:after="40"/>
+        <w:ind w:left="360"/>
+      </w:pPr>
+      <w:r>
+        <w:rPr>
+          <w:b/>
+          <w:color w:val="A8853C"/>
+          <w:sz w:val="21"/>
+          <w:szCs w:val="21"/>
+        </w:rPr>
+        <w:t xml:space="preserve">•  </w:t>
+      </w:r>
+      <w:r>
+        <w:rPr>
+          <w:color w:val="1A2330"/>
+          <w:sz w:val="21"/>
+          <w:szCs w:val="21"/>
+        </w:rPr>
+        <w:t xml:space="preserve">Incluye el paso a paso para dar acceso a un procurador: que se registre, y que el administrador le asigne el rol «Procurador» en la pestaña Usuarios.</w:t>
+      </w:r>
+    </w:p>
+    <w:p>
+      <w:pPr>
+        <w:spacing w:before="0" w:after="40"/>
+        <w:ind w:left="360"/>
+      </w:pPr>
+      <w:r>
+        <w:rPr>
+          <w:b/>
+          <w:color w:val="A8853C"/>
+          <w:sz w:val="21"/>
+          <w:szCs w:val="21"/>
+        </w:rPr>
+        <w:t xml:space="preserve">•  </w:t>
+      </w:r>
+      <w:r>
+        <w:rPr>
+          <w:color w:val="1A2330"/>
+          <w:sz w:val="21"/>
+          <w:szCs w:val="21"/>
+        </w:rPr>
+        <w:t xml:space="preserve">Cada persona debe tener su propia cuenta y contraseña; no se comparte la llave maestra.</w:t>
+      </w:r>
+    </w:p>
+    <w:p>
+      <w:pPr>
+        <w:spacing w:before="60" w:after="120"/>
+        <w:ind w:left="120"/>
+        <w:shd w:val="clear" w:fill="F6F4ED"/>
+      </w:pPr>
+      <w:r>
+        <w:rPr>
+          <w:b/>
+          <w:color w:val="A8853C"/>
+          <w:sz w:val="20"/>
+          <w:szCs w:val="20"/>
+        </w:rPr>
+        <w:t xml:space="preserve">Confidencial:  </w:t>
+      </w:r>
+      <w:r>
+        <w:rPr>
+          <w:color w:val="1A2330"/>
+          <w:sz w:val="20"/>
+          <w:szCs w:val="20"/>
+        </w:rPr>
+        <w:t xml:space="preserve">La información de esta pestaña es confidencial. No incluye contraseñas escritas; indica cómo entrar y cómo recuperarlas si se olvidan (enlace al Gmail del bufete).</w:t>
+      </w:r>
+    </w:p>
+    <w:p>
+      <w:pPr>
+        <w:spacing w:before="200" w:after="80"/>
+      </w:pPr>
+      <w:r>
+        <w:rPr>
+          <w:b/>
+          <w:color w:val="0E1B2C"/>
+          <w:sz w:val="30"/>
+          <w:szCs w:val="30"/>
+        </w:rPr>
+        <w:t xml:space="preserve">21. Soporte</w:t>
       </w:r>
     </w:p>
     <w:p>

</xml_diff>

<commit_message>
Logo del bufete (derecho+tecnologia+sistemas) y credencial/carnet imprimible en la pestana Credenciales
</commit_message>
<xml_diff>
--- a/Manual-Sistema-LexFive.docx
+++ b/Manual-Sistema-LexFive.docx
@@ -321,7 +321,7 @@
           <w:sz w:val="21"/>
           <w:szCs w:val="21"/>
         </w:rPr>
-        <w:t xml:space="preserve">•  20. Credenciales y accesos (administrador y abogados)</w:t>
+        <w:t xml:space="preserve">•  20. Credenciales del bufete (administrador y abogados)</w:t>
       </w:r>
     </w:p>
     <w:p>
@@ -3384,7 +3384,7 @@
           <w:sz w:val="30"/>
           <w:szCs w:val="30"/>
         </w:rPr>
-        <w:t xml:space="preserve">20. Credenciales y accesos (administrador y abogados)</w:t>
+        <w:t xml:space="preserve">20. Credenciales del bufete (administrador y abogados)</w:t>
       </w:r>
     </w:p>
     <w:p>
@@ -3397,76 +3397,89 @@
           <w:sz w:val="21"/>
           <w:szCs w:val="21"/>
         </w:rPr>
-        <w:t xml:space="preserve">El panel incluye una pestaña «Credenciales», visible solo para el administrador y los abogados (los procuradores y clientes no la ven). Reúne, dentro del propio sistema, cómo se ingresa a cada plataforma (GitHub, Netlify, Supabase, Web3Forms) y el panel, además del recordatorio de la «llave maestra» (el Gmail del bufete).</w:t>
-      </w:r>
-    </w:p>
-    <w:p>
-      <w:pPr>
-        <w:spacing w:before="0" w:after="40"/>
-        <w:ind w:left="360"/>
-      </w:pPr>
-      <w:r>
-        <w:rPr>
-          <w:b/>
-          <w:color w:val="A8853C"/>
-          <w:sz w:val="21"/>
-          <w:szCs w:val="21"/>
-        </w:rPr>
-        <w:t xml:space="preserve">•  </w:t>
-      </w:r>
-      <w:r>
-        <w:rPr>
-          <w:color w:val="1A2330"/>
-          <w:sz w:val="21"/>
-          <w:szCs w:val="21"/>
-        </w:rPr>
-        <w:t xml:space="preserve">Solo el administrador y los abogados pueden consultarla; son ellos quienes entregan las credenciales a sus procuradores.</w:t>
-      </w:r>
-    </w:p>
-    <w:p>
-      <w:pPr>
-        <w:spacing w:before="0" w:after="40"/>
-        <w:ind w:left="360"/>
-      </w:pPr>
-      <w:r>
-        <w:rPr>
-          <w:b/>
-          <w:color w:val="A8853C"/>
-          <w:sz w:val="21"/>
-          <w:szCs w:val="21"/>
-        </w:rPr>
-        <w:t xml:space="preserve">•  </w:t>
-      </w:r>
-      <w:r>
-        <w:rPr>
-          <w:color w:val="1A2330"/>
-          <w:sz w:val="21"/>
-          <w:szCs w:val="21"/>
-        </w:rPr>
-        <w:t xml:space="preserve">Incluye el paso a paso para dar acceso a un procurador: que se registre, y que el administrador le asigne el rol «Procurador» en la pestaña Usuarios.</w:t>
-      </w:r>
-    </w:p>
-    <w:p>
-      <w:pPr>
-        <w:spacing w:before="0" w:after="40"/>
-        <w:ind w:left="360"/>
-      </w:pPr>
-      <w:r>
-        <w:rPr>
-          <w:b/>
-          <w:color w:val="A8853C"/>
-          <w:sz w:val="21"/>
-          <w:szCs w:val="21"/>
-        </w:rPr>
-        <w:t xml:space="preserve">•  </w:t>
-      </w:r>
-      <w:r>
-        <w:rPr>
-          <w:color w:val="1A2330"/>
-          <w:sz w:val="21"/>
-          <w:szCs w:val="21"/>
-        </w:rPr>
-        <w:t xml:space="preserve">Cada persona debe tener su propia cuenta y contraseña; no se comparte la llave maestra.</w:t>
+        <w:t xml:space="preserve">El panel incluye una pestaña «Credenciales», visible solo para el administrador y los abogados (los procuradores y clientes no la ven). Genera una credencial o carnet oficial de LexFive con los datos del usuario, lista para imprimir o guardar como PDF.</w:t>
+      </w:r>
+    </w:p>
+    <w:p>
+      <w:pPr>
+        <w:spacing w:before="0" w:after="40"/>
+        <w:ind w:left="360"/>
+      </w:pPr>
+      <w:r>
+        <w:rPr>
+          <w:b/>
+          <w:color w:val="A8853C"/>
+          <w:sz w:val="21"/>
+          <w:szCs w:val="21"/>
+        </w:rPr>
+        <w:t xml:space="preserve">•  </w:t>
+      </w:r>
+      <w:r>
+        <w:rPr>
+          <w:color w:val="1A2330"/>
+          <w:sz w:val="21"/>
+          <w:szCs w:val="21"/>
+        </w:rPr>
+        <w:t xml:space="preserve">La credencial muestra el nombre, el cargo, un número de credencial, el correo y las fechas de emisión y validez, con el logotipo y los colores del bufete.</w:t>
+      </w:r>
+    </w:p>
+    <w:p>
+      <w:pPr>
+        <w:spacing w:before="0" w:after="40"/>
+        <w:ind w:left="360"/>
+      </w:pPr>
+      <w:r>
+        <w:rPr>
+          <w:b/>
+          <w:color w:val="A8853C"/>
+          <w:sz w:val="21"/>
+          <w:szCs w:val="21"/>
+        </w:rPr>
+        <w:t xml:space="preserve">•  </w:t>
+      </w:r>
+      <w:r>
+        <w:rPr>
+          <w:color w:val="1A2330"/>
+          <w:sz w:val="21"/>
+          <w:szCs w:val="21"/>
+        </w:rPr>
+        <w:t xml:space="preserve">El botón «Imprimir / Guardar PDF» imprime solo la credencial (anverso y reverso).</w:t>
+      </w:r>
+    </w:p>
+    <w:p>
+      <w:pPr>
+        <w:spacing w:before="0" w:after="40"/>
+        <w:ind w:left="360"/>
+      </w:pPr>
+      <w:r>
+        <w:rPr>
+          <w:b/>
+          <w:color w:val="A8853C"/>
+          <w:sz w:val="21"/>
+          <w:szCs w:val="21"/>
+        </w:rPr>
+        <w:t xml:space="preserve">•  </w:t>
+      </w:r>
+      <w:r>
+        <w:rPr>
+          <w:color w:val="1A2330"/>
+          <w:sz w:val="21"/>
+          <w:szCs w:val="21"/>
+        </w:rPr>
+        <w:t xml:space="preserve">Cada persona obtiene su credencial con sus propios datos al iniciar sesión.</w:t>
+      </w:r>
+    </w:p>
+    <w:p>
+      <w:pPr>
+        <w:spacing w:before="0" w:after="80"/>
+      </w:pPr>
+      <w:r>
+        <w:rPr>
+          <w:color w:val="1A2330"/>
+          <w:sz w:val="21"/>
+          <w:szCs w:val="21"/>
+        </w:rPr>
+        <w:t xml:space="preserve">El administrador y los abogados son quienes entregan las credenciales a sus procuradores. Para habilitar a un procurador: que se registre en el sistema, y que el administrador le asigne el rol «Procurador» en la pestaña Usuarios; luego, al ingresar, el procurador tendrá su propia credencial.</w:t>
       </w:r>
     </w:p>
     <w:p>
@@ -3482,7 +3495,7 @@
           <w:sz w:val="20"/>
           <w:szCs w:val="20"/>
         </w:rPr>
-        <w:t xml:space="preserve">Confidencial:  </w:t>
+        <w:t xml:space="preserve">Importante:  </w:t>
       </w:r>
       <w:r>
         <w:rPr>
@@ -3490,7 +3503,7 @@
           <w:sz w:val="20"/>
           <w:szCs w:val="20"/>
         </w:rPr>
-        <w:t xml:space="preserve">La información de esta pestaña es confidencial. No incluye contraseñas escritas; indica cómo entrar y cómo recuperarlas si se olvidan (enlace al Gmail del bufete).</w:t>
+        <w:t xml:space="preserve">Cada persona tiene su propia cuenta y su propia credencial. No se comparten contraseñas ni la cuenta principal del bufete.</w:t>
       </w:r>
     </w:p>
     <w:p>

</xml_diff>

<commit_message>
Credencial: 5 modelos de logo a elegir, telefonos personal/oficina, frase y base legal editables; quitar icono grande de llave
</commit_message>
<xml_diff>
--- a/Manual-Sistema-LexFive.docx
+++ b/Manual-Sistema-LexFive.docx
@@ -3397,76 +3397,99 @@
           <w:sz w:val="21"/>
           <w:szCs w:val="21"/>
         </w:rPr>
-        <w:t xml:space="preserve">El panel incluye una pestaña «Credenciales», visible solo para el administrador y los abogados (los procuradores y clientes no la ven). Genera una credencial o carnet oficial de LexFive con los datos del usuario, lista para imprimir o guardar como PDF.</w:t>
-      </w:r>
-    </w:p>
-    <w:p>
-      <w:pPr>
-        <w:spacing w:before="0" w:after="40"/>
-        <w:ind w:left="360"/>
-      </w:pPr>
-      <w:r>
-        <w:rPr>
-          <w:b/>
-          <w:color w:val="A8853C"/>
-          <w:sz w:val="21"/>
-          <w:szCs w:val="21"/>
-        </w:rPr>
-        <w:t xml:space="preserve">•  </w:t>
-      </w:r>
-      <w:r>
-        <w:rPr>
-          <w:color w:val="1A2330"/>
-          <w:sz w:val="21"/>
-          <w:szCs w:val="21"/>
-        </w:rPr>
-        <w:t xml:space="preserve">La credencial muestra el nombre, el cargo, un número de credencial, el correo y las fechas de emisión y validez, con el logotipo y los colores del bufete.</w:t>
-      </w:r>
-    </w:p>
-    <w:p>
-      <w:pPr>
-        <w:spacing w:before="0" w:after="40"/>
-        <w:ind w:left="360"/>
-      </w:pPr>
-      <w:r>
-        <w:rPr>
-          <w:b/>
-          <w:color w:val="A8853C"/>
-          <w:sz w:val="21"/>
-          <w:szCs w:val="21"/>
-        </w:rPr>
-        <w:t xml:space="preserve">•  </w:t>
-      </w:r>
-      <w:r>
-        <w:rPr>
-          <w:color w:val="1A2330"/>
-          <w:sz w:val="21"/>
-          <w:szCs w:val="21"/>
-        </w:rPr>
-        <w:t xml:space="preserve">El botón «Imprimir / Guardar PDF» imprime solo la credencial (anverso y reverso).</w:t>
-      </w:r>
-    </w:p>
-    <w:p>
-      <w:pPr>
-        <w:spacing w:before="0" w:after="40"/>
-        <w:ind w:left="360"/>
-      </w:pPr>
-      <w:r>
-        <w:rPr>
-          <w:b/>
-          <w:color w:val="A8853C"/>
-          <w:sz w:val="21"/>
-          <w:szCs w:val="21"/>
-        </w:rPr>
-        <w:t xml:space="preserve">•  </w:t>
-      </w:r>
-      <w:r>
-        <w:rPr>
-          <w:color w:val="1A2330"/>
-          <w:sz w:val="21"/>
-          <w:szCs w:val="21"/>
-        </w:rPr>
-        <w:t xml:space="preserve">Cada persona obtiene su credencial con sus propios datos al iniciar sesión.</w:t>
+        <w:t xml:space="preserve">El panel incluye una pestaña «Credenciales», visible solo para el administrador y los abogados (los procuradores y clientes no la ven). Genera una credencial o carnet de LexFive con fondo blanco, tamaño 8.5 x 6 cm, lista para imprimir o guardar como PDF.</w:t>
+      </w:r>
+    </w:p>
+    <w:p>
+      <w:pPr>
+        <w:spacing w:before="0" w:after="40"/>
+        <w:ind w:left="360"/>
+      </w:pPr>
+      <w:r>
+        <w:rPr>
+          <w:b/>
+          <w:color w:val="A8853C"/>
+          <w:sz w:val="21"/>
+          <w:szCs w:val="21"/>
+        </w:rPr>
+        <w:t xml:space="preserve">•  </w:t>
+      </w:r>
+      <w:r>
+        <w:rPr>
+          <w:color w:val="1A2330"/>
+          <w:sz w:val="21"/>
+          <w:szCs w:val="21"/>
+        </w:rPr>
+        <w:t xml:space="preserve">Usted llena los datos: nombre, cargo, carnet de identidad, correo, teléfono personal y de oficina, y las fechas de emisión y validez. La credencial se actualiza en vivo.</w:t>
+      </w:r>
+    </w:p>
+    <w:p>
+      <w:pPr>
+        <w:spacing w:before="0" w:after="40"/>
+        <w:ind w:left="360"/>
+      </w:pPr>
+      <w:r>
+        <w:rPr>
+          <w:b/>
+          <w:color w:val="A8853C"/>
+          <w:sz w:val="21"/>
+          <w:szCs w:val="21"/>
+        </w:rPr>
+        <w:t xml:space="preserve">•  </w:t>
+      </w:r>
+      <w:r>
+        <w:rPr>
+          <w:color w:val="1A2330"/>
+          <w:sz w:val="21"/>
+          <w:szCs w:val="21"/>
+        </w:rPr>
+        <w:t xml:space="preserve">Puede elegir el logotipo del bufete entre varios modelos; el elegido se aplica en toda la página, el panel y la credencial.</w:t>
+      </w:r>
+    </w:p>
+    <w:p>
+      <w:pPr>
+        <w:spacing w:before="0" w:after="40"/>
+        <w:ind w:left="360"/>
+      </w:pPr>
+      <w:r>
+        <w:rPr>
+          <w:b/>
+          <w:color w:val="A8853C"/>
+          <w:sz w:val="21"/>
+          <w:szCs w:val="21"/>
+        </w:rPr>
+        <w:t xml:space="preserve">•  </w:t>
+      </w:r>
+      <w:r>
+        <w:rPr>
+          <w:color w:val="1A2330"/>
+          <w:sz w:val="21"/>
+          <w:szCs w:val="21"/>
+        </w:rPr>
+        <w:t xml:space="preserve">En el reverso puede escribir una frase del bufete y la base legal que faculta la representación del procurador (texto que redacta usted como abogado).</w:t>
+      </w:r>
+    </w:p>
+    <w:p>
+      <w:pPr>
+        <w:spacing w:before="0" w:after="40"/>
+        <w:ind w:left="360"/>
+      </w:pPr>
+      <w:r>
+        <w:rPr>
+          <w:b/>
+          <w:color w:val="A8853C"/>
+          <w:sz w:val="21"/>
+          <w:szCs w:val="21"/>
+        </w:rPr>
+        <w:t xml:space="preserve">•  </w:t>
+      </w:r>
+      <w:r>
+        <w:rPr>
+          <w:color w:val="1A2330"/>
+          <w:sz w:val="21"/>
+          <w:szCs w:val="21"/>
+        </w:rPr>
+        <w:t xml:space="preserve">Hay líneas para la firma autorizada y el sello del bufete, sobre fondo blanco.</w:t>
       </w:r>
     </w:p>
     <w:p>
@@ -3479,7 +3502,7 @@
           <w:sz w:val="21"/>
           <w:szCs w:val="21"/>
         </w:rPr>
-        <w:t xml:space="preserve">El administrador y los abogados son quienes entregan las credenciales a sus procuradores. Para habilitar a un procurador: que se registre en el sistema, y que el administrador le asigne el rol «Procurador» en la pestaña Usuarios; luego, al ingresar, el procurador tendrá su propia credencial.</w:t>
+        <w:t xml:space="preserve">El administrador y los abogados entregan las credenciales a sus procuradores: el procurador se registra, el administrador le asigna el rol «Procurador» en Usuarios, y luego se llena e imprime su credencial.</w:t>
       </w:r>
     </w:p>
     <w:p>
@@ -3503,7 +3526,7 @@
           <w:sz w:val="20"/>
           <w:szCs w:val="20"/>
         </w:rPr>
-        <w:t xml:space="preserve">Cada persona tiene su propia cuenta y su propia credencial. No se comparten contraseñas ni la cuenta principal del bufete.</w:t>
+        <w:t xml:space="preserve">La base legal de la representación la redacta usted con su criterio profesional; el sistema no inventa números de artículo. Cada persona tiene su propia cuenta y no se comparten contraseñas.</w:t>
       </w:r>
     </w:p>
     <w:p>

</xml_diff>

<commit_message>
Rendimiento (Service Worker) y manual actualizado
- sw.js: cambia la estrategia a 'stale-while-revalidate' para recursos
  estaticos (CSS, JS, imagenes, logos, fuentes): se sirven al instante
  desde la cache y se actualizan en segundo plano. Antes todo (incluidos
  iconos y estilos) esperaba la red en cada re-render, lo que hacia sentir
  lento el sistema al subir archivos o eliminar. HTML sigue 'red primero'.
  Cache sube a v4.
- Manual: documenta credenciales guardadas/editables en la nube, vista
  previa, intensidad del logo de fondo y buscador; nueva seccion 21
  'Respaldos, instalacion y conexion'. Regenerados PDF/DOCX/MD.
</commit_message>
<xml_diff>
--- a/Manual-Sistema-LexFive.docx
+++ b/Manual-Sistema-LexFive.docx
@@ -335,7 +335,21 @@
           <w:sz w:val="21"/>
           <w:szCs w:val="21"/>
         </w:rPr>
-        <w:t xml:space="preserve">•  21. Soporte</w:t>
+        <w:t xml:space="preserve">•  21. Respaldos, instalación y conexión a internet</w:t>
+      </w:r>
+    </w:p>
+    <w:p>
+      <w:pPr>
+        <w:spacing w:before="0" w:after="20"/>
+        <w:ind w:left="120"/>
+      </w:pPr>
+      <w:r>
+        <w:rPr>
+          <w:color w:val="1A2330"/>
+          <w:sz w:val="21"/>
+          <w:szCs w:val="21"/>
+        </w:rPr>
+        <w:t xml:space="preserve">•  22. Soporte</w:t>
       </w:r>
     </w:p>
     <w:p>
@@ -3397,7 +3411,7 @@
           <w:sz w:val="21"/>
           <w:szCs w:val="21"/>
         </w:rPr>
-        <w:t xml:space="preserve">El panel incluye una pestaña «Credenciales», visible solo para el administrador y los abogados (los procuradores y clientes no la ven). Genera una credencial o carnet de LexFive con fondo blanco, tamaño 8.5 x 6 cm, lista para imprimir o guardar como PDF.</w:t>
+        <w:t xml:space="preserve">El panel incluye una pestaña «Credenciales», visible solo para el administrador y los abogados (los procuradores y clientes no la ven). Genera una credencial o carnet de LexFive con fondo blanco, tamaño 9 x 6 cm y con una guía de corte punteada para recortarla, lista para imprimir o guardar como PDF.</w:t>
       </w:r>
     </w:p>
     <w:p>
@@ -3443,7 +3457,76 @@
           <w:sz w:val="21"/>
           <w:szCs w:val="21"/>
         </w:rPr>
-        <w:t xml:space="preserve">Puede elegir el logotipo del bufete entre varios modelos; el elegido se aplica en toda la página, el panel y la credencial.</w:t>
+        <w:t xml:space="preserve">Puede elegir el logotipo del bufete entre varios modelos; el elegido se aplica en toda la página, el panel y la credencial. El logo y el sello se sincronizan en la nube y se actualizan en vivo en todos los dispositivos (computadora y celular).</w:t>
+      </w:r>
+    </w:p>
+    <w:p>
+      <w:pPr>
+        <w:spacing w:before="0" w:after="40"/>
+        <w:ind w:left="360"/>
+      </w:pPr>
+      <w:r>
+        <w:rPr>
+          <w:b/>
+          <w:color w:val="A8853C"/>
+          <w:sz w:val="21"/>
+          <w:szCs w:val="21"/>
+        </w:rPr>
+        <w:t xml:space="preserve">•  </w:t>
+      </w:r>
+      <w:r>
+        <w:rPr>
+          <w:color w:val="1A2330"/>
+          <w:sz w:val="21"/>
+          <w:szCs w:val="21"/>
+        </w:rPr>
+        <w:t xml:space="preserve">Puede regular la «Intensidad del logo de fondo» (la marca de agua de la credencial) con un control deslizante; el ajuste se guarda y se aplica en todos los dispositivos.</w:t>
+      </w:r>
+    </w:p>
+    <w:p>
+      <w:pPr>
+        <w:spacing w:before="0" w:after="40"/>
+        <w:ind w:left="360"/>
+      </w:pPr>
+      <w:r>
+        <w:rPr>
+          <w:b/>
+          <w:color w:val="A8853C"/>
+          <w:sz w:val="21"/>
+          <w:szCs w:val="21"/>
+        </w:rPr>
+        <w:t xml:space="preserve">•  </w:t>
+      </w:r>
+      <w:r>
+        <w:rPr>
+          <w:color w:val="1A2330"/>
+          <w:sz w:val="21"/>
+          <w:szCs w:val="21"/>
+        </w:rPr>
+        <w:t xml:space="preserve">Las credenciales que crea quedan GUARDADAS en la nube: en «Credenciales guardadas» puede verlas, editarlas, volver a imprimirlas o eliminarlas desde cualquier dispositivo. Si tiene muchas, use el buscador por nombre, carnet o cargo.</w:t>
+      </w:r>
+    </w:p>
+    <w:p>
+      <w:pPr>
+        <w:spacing w:before="0" w:after="40"/>
+        <w:ind w:left="360"/>
+      </w:pPr>
+      <w:r>
+        <w:rPr>
+          <w:b/>
+          <w:color w:val="A8853C"/>
+          <w:sz w:val="21"/>
+          <w:szCs w:val="21"/>
+        </w:rPr>
+        <w:t xml:space="preserve">•  </w:t>
+      </w:r>
+      <w:r>
+        <w:rPr>
+          <w:color w:val="1A2330"/>
+          <w:sz w:val="21"/>
+          <w:szCs w:val="21"/>
+        </w:rPr>
+        <w:t xml:space="preserve">Con el botón «Vista previa» revisa cómo saldrá la credencial (ambas caras) antes de imprimir o guardar el PDF.</w:t>
       </w:r>
     </w:p>
     <w:p>
@@ -3540,7 +3623,150 @@
           <w:sz w:val="30"/>
           <w:szCs w:val="30"/>
         </w:rPr>
-        <w:t xml:space="preserve">21. Soporte</w:t>
+        <w:t xml:space="preserve">21. Respaldos, instalación y conexión a internet</w:t>
+      </w:r>
+    </w:p>
+    <w:p>
+      <w:pPr>
+        <w:spacing w:before="0" w:after="80"/>
+      </w:pPr>
+      <w:r>
+        <w:rPr>
+          <w:color w:val="1A2330"/>
+          <w:sz w:val="21"/>
+          <w:szCs w:val="21"/>
+        </w:rPr>
+        <w:t xml:space="preserve">El sistema incluye varias ayudas para la seguridad de los datos y la comodidad de uso:</w:t>
+      </w:r>
+    </w:p>
+    <w:p>
+      <w:pPr>
+        <w:spacing w:before="0" w:after="40"/>
+        <w:ind w:left="360"/>
+      </w:pPr>
+      <w:r>
+        <w:rPr>
+          <w:b/>
+          <w:color w:val="A8853C"/>
+          <w:sz w:val="21"/>
+          <w:szCs w:val="21"/>
+        </w:rPr>
+        <w:t xml:space="preserve">•  </w:t>
+      </w:r>
+      <w:r>
+        <w:rPr>
+          <w:color w:val="1A2330"/>
+          <w:sz w:val="21"/>
+          <w:szCs w:val="21"/>
+        </w:rPr>
+        <w:t xml:space="preserve">Respaldo automático: la base de datos se respalda sola cada día (mediante GitHub Actions). No tiene que hacer nada.</w:t>
+      </w:r>
+    </w:p>
+    <w:p>
+      <w:pPr>
+        <w:spacing w:before="0" w:after="40"/>
+        <w:ind w:left="360"/>
+      </w:pPr>
+      <w:r>
+        <w:rPr>
+          <w:b/>
+          <w:color w:val="A8853C"/>
+          <w:sz w:val="21"/>
+          <w:szCs w:val="21"/>
+        </w:rPr>
+        <w:t xml:space="preserve">•  </w:t>
+      </w:r>
+      <w:r>
+        <w:rPr>
+          <w:color w:val="1A2330"/>
+          <w:sz w:val="21"/>
+          <w:szCs w:val="21"/>
+        </w:rPr>
+        <w:t xml:space="preserve">Respaldo manual: en el «Panel general», el administrador puede pulsar «Exportar respaldo (JSON)» para descargar una copia de los datos principales en su equipo. Se muestra la fecha del último respaldo manual.</w:t>
+      </w:r>
+    </w:p>
+    <w:p>
+      <w:pPr>
+        <w:spacing w:before="0" w:after="40"/>
+        <w:ind w:left="360"/>
+      </w:pPr>
+      <w:r>
+        <w:rPr>
+          <w:b/>
+          <w:color w:val="A8853C"/>
+          <w:sz w:val="21"/>
+          <w:szCs w:val="21"/>
+        </w:rPr>
+        <w:t xml:space="preserve">•  </w:t>
+      </w:r>
+      <w:r>
+        <w:rPr>
+          <w:color w:val="1A2330"/>
+          <w:sz w:val="21"/>
+          <w:szCs w:val="21"/>
+        </w:rPr>
+        <w:t xml:space="preserve">Instalar como app: en el celular puede «Agregar a la pantalla de inicio» desde el navegador y usar el sistema como una aplicación (abre más rápido y a pantalla completa).</w:t>
+      </w:r>
+    </w:p>
+    <w:p>
+      <w:pPr>
+        <w:spacing w:before="0" w:after="40"/>
+        <w:ind w:left="360"/>
+      </w:pPr>
+      <w:r>
+        <w:rPr>
+          <w:b/>
+          <w:color w:val="A8853C"/>
+          <w:sz w:val="21"/>
+          <w:szCs w:val="21"/>
+        </w:rPr>
+        <w:t xml:space="preserve">•  </w:t>
+      </w:r>
+      <w:r>
+        <w:rPr>
+          <w:color w:val="1A2330"/>
+          <w:sz w:val="21"/>
+          <w:szCs w:val="21"/>
+        </w:rPr>
+        <w:t xml:space="preserve">Aviso de «sin conexión»: si se queda sin internet, aparece un aviso. Lo que guarde queda en el equipo y se sincroniza al volver la conexión.</w:t>
+      </w:r>
+    </w:p>
+    <w:p>
+      <w:pPr>
+        <w:spacing w:before="60" w:after="120"/>
+        <w:ind w:left="120"/>
+        <w:shd w:val="clear" w:fill="F6F4ED"/>
+      </w:pPr>
+      <w:r>
+        <w:rPr>
+          <w:b/>
+          <w:color w:val="A8853C"/>
+          <w:sz w:val="20"/>
+          <w:szCs w:val="20"/>
+        </w:rPr>
+        <w:t xml:space="preserve">Recomendación:  </w:t>
+      </w:r>
+      <w:r>
+        <w:rPr>
+          <w:color w:val="1A2330"/>
+          <w:sz w:val="20"/>
+          <w:szCs w:val="20"/>
+        </w:rPr>
+        <w:t xml:space="preserve">Guarde los respaldos manuales en un lugar seguro. Son útiles si necesita revisar o restaurar datos antiguos.</w:t>
+      </w:r>
+    </w:p>
+    <w:p>
+      <w:pPr>
+        <w:spacing w:before="200" w:after="80"/>
+      </w:pPr>
+      <w:r>
+        <w:rPr>
+          <w:b/>
+          <w:color w:val="0E1B2C"/>
+          <w:sz w:val="30"/>
+          <w:szCs w:val="30"/>
+        </w:rPr>
+        <w:t xml:space="preserve">22. Soporte</w:t>
       </w:r>
     </w:p>
     <w:p>

</xml_diff>

<commit_message>
Sitio web: subida robusta (fallback a base64), JPEG, limite 25 MB y ampliar imagen
- Si la subida a Supabase Storage falla (bucket no configurado o sin red), la imagen ya NO se rechaza: se guarda optimizada en la configuracion (base64), igual que logos/sellos. Asi funciona en todos los dispositivos sin configurar nada en Supabase. Arregla el error 'No se pudo subir la imagen'.
- Optimizacion en JPEG (mas liviana que PNG para fotos) limitando el lado mayor; sube rapido y no infla la base.
- Limite de subida 6 MB -> 25 MB (el sistema igual la optimiza).
- Nuevo boton 'Ampliar' y vista en grande de cada imagen (como logos/sellos).
- SW del panel a v34.
- Manuales y resumen actualizados (25 MB y boton Ampliar).
</commit_message>
<xml_diff>
--- a/Manual-Sistema-LexFive.docx
+++ b/Manual-Sistema-LexFive.docx
@@ -4156,7 +4156,7 @@
           <w:sz w:val="21"/>
           <w:szCs w:val="21"/>
         </w:rPr>
-        <w:t xml:space="preserve">Cada imagen tiene botones «Subir» y «Quitar». Al quitarla, vuelve la ilustración o el fondo por defecto.</w:t>
+        <w:t xml:space="preserve">Cada imagen tiene botones «Subir» y «Quitar», y «Ampliar» para verla en grande. Al quitarla, vuelve la ilustración o el fondo por defecto.</w:t>
       </w:r>
     </w:p>
     <w:p>
@@ -4169,7 +4169,7 @@
           <w:sz w:val="21"/>
           <w:szCs w:val="21"/>
         </w:rPr>
-        <w:t xml:space="preserve">Formatos admitidos: JPG, PNG o WebP (máximo 6 MB; el sistema las optimiza al subir).</w:t>
+        <w:t xml:space="preserve">Formatos admitidos: JPG, PNG o WebP (máximo 25 MB; el sistema las optimiza al subir, así que no necesita reducirlas usted).</w:t>
       </w:r>
     </w:p>
     <w:p>
@@ -4193,7 +4193,7 @@
           <w:sz w:val="20"/>
           <w:szCs w:val="20"/>
         </w:rPr>
-        <w:t xml:space="preserve">Todo se guarda en la configuración compartida del bufete (branding) y no requiere ningún script SQL. Consejo: para el fondo del encabezado, use imágenes oscuras o con poco detalle en el centro, ya que el título y los botones van encima.</w:t>
+        <w:t xml:space="preserve">Todo se guarda en la configuración compartida del bufete (branding) y no requiere ningún script SQL. Las imágenes se sincronizan solas en todos los dispositivos y en la web pública. Consejo: para el fondo del encabezado, use imágenes oscuras o con poco detalle en el centro, ya que el título y los botones van encima.</w:t>
       </w:r>
     </w:p>
     <w:p>

</xml_diff>